<commit_message>
KO and Sub-KO; Appointment Letter; templates as re-made on 11 Oct
- KOData (renamed from CSPData) and SUBKOData are both read; write-back goes
  to the tab the code's length says (8 = KO, 9-10 = Sub-KO).
- Training Certificate: 'KO/Sub-KO Code' becomes 'KO Code' or
  'Sub-KO Code' by the code's length, and validation checks it.
- BCP is made for a KO only: enforced in generation and the missing-data
  check; the RM screen does not offer it for a Sub-KO; the dashboard does
  not count a Sub-KO as pending one.
- CSP Certificate is now the Appointment Letter (internal code unchanged so
  the 64 stored documents keep their type).
- Photo boxes are now 35 x 45 mm table cells: marker matched across the
  cell's lines, cell padding cleared at generation. Measured in the PDF:
  35.0 x 45.0 mm on both documents.
- BCP placeholders renamed in Word; old floating-frame tests replaced with
  checks for the new cells.

Co-Authored-By: Claude Opus 5.5 <noreply@anthropic.com>
</commit_message>
<xml_diff>
--- a/templates/documents/BCP.docx
+++ b/templates/documents/BCP.docx
@@ -5,27 +5,51 @@
     <w:p>
       <w:pPr>
         <w:pStyle w:val="Title"/>
-        <w:spacing w:line="276" w:lineRule="auto"/>
+        <w:pBdr>
+          <w:bottom w:val="single" w:sz="12" w:space="4" w:color="FFA700"/>
+        </w:pBdr>
+        <w:spacing w:after="60" w:line="276" w:lineRule="auto"/>
       </w:pPr>
       <w:r>
+        <w:rPr>
+          <w:color w:val="1F3864"/>
+          <w:sz w:val="30"/>
+          <w:szCs w:val="30"/>
+        </w:rPr>
         <w:t>Business</w:t>
       </w:r>
       <w:r>
         <w:rPr>
+          <w:color w:val="1F3864"/>
           <w:spacing w:val="-19"/>
+          <w:sz w:val="30"/>
+          <w:szCs w:val="30"/>
         </w:rPr>
         <w:t xml:space="preserve"> </w:t>
       </w:r>
       <w:r>
+        <w:rPr>
+          <w:color w:val="1F3864"/>
+          <w:sz w:val="30"/>
+          <w:szCs w:val="30"/>
+        </w:rPr>
         <w:t>Continuity</w:t>
       </w:r>
       <w:r>
         <w:rPr>
+          <w:color w:val="1F3864"/>
           <w:spacing w:val="-18"/>
+          <w:sz w:val="30"/>
+          <w:szCs w:val="30"/>
         </w:rPr>
         <w:t xml:space="preserve"> </w:t>
       </w:r>
       <w:r>
+        <w:rPr>
+          <w:color w:val="1F3864"/>
+          <w:sz w:val="30"/>
+          <w:szCs w:val="30"/>
+        </w:rPr>
         <w:t>Plan BC/CSP Details</w:t>
       </w:r>
     </w:p>
@@ -43,12 +67,12 @@
         <w:tblW w:w="0" w:type="auto"/>
         <w:tblInd w:w="257" w:type="dxa"/>
         <w:tblBorders>
-          <w:top w:val="single" w:sz="4" w:space="0" w:color="000000"/>
-          <w:left w:val="single" w:sz="4" w:space="0" w:color="000000"/>
-          <w:bottom w:val="single" w:sz="4" w:space="0" w:color="000000"/>
-          <w:right w:val="single" w:sz="4" w:space="0" w:color="000000"/>
-          <w:insideH w:val="single" w:sz="4" w:space="0" w:color="000000"/>
-          <w:insideV w:val="single" w:sz="4" w:space="0" w:color="000000"/>
+          <w:top w:val="single" w:sz="4" w:space="0" w:color="8FA3BF"/>
+          <w:left w:val="single" w:sz="4" w:space="0" w:color="8FA3BF"/>
+          <w:bottom w:val="single" w:sz="4" w:space="0" w:color="8FA3BF"/>
+          <w:right w:val="single" w:sz="4" w:space="0" w:color="8FA3BF"/>
+          <w:insideH w:val="single" w:sz="4" w:space="0" w:color="8FA3BF"/>
+          <w:insideV w:val="single" w:sz="4" w:space="0" w:color="8FA3BF"/>
         </w:tblBorders>
         <w:tblLayout w:type="fixed"/>
         <w:tblCellMar>
@@ -70,6 +94,8 @@
         <w:tc>
           <w:tcPr>
             <w:tcW w:w="4076" w:type="dxa"/>
+            <w:shd w:val="clear" w:color="auto" w:fill="EEF3FA"/>
+            <w:vAlign w:val="center"/>
           </w:tcPr>
           <w:p>
             <w:pPr>
@@ -82,12 +108,14 @@
             <w:r>
               <w:rPr>
                 <w:b/>
+                <w:color w:val="1F3864"/>
               </w:rPr>
               <w:t>Name</w:t>
             </w:r>
             <w:r>
               <w:rPr>
                 <w:b/>
+                <w:color w:val="1F3864"/>
                 <w:spacing w:val="-3"/>
               </w:rPr>
               <w:t xml:space="preserve"> </w:t>
@@ -95,25 +123,29 @@
             <w:r>
               <w:rPr>
                 <w:b/>
+                <w:color w:val="1F3864"/>
               </w:rPr>
               <w:t>of</w:t>
             </w:r>
             <w:r>
               <w:rPr>
                 <w:b/>
-                <w:spacing w:val="-2"/>
-              </w:rPr>
-              <w:t xml:space="preserve"> </w:t>
-            </w:r>
-            <w:r>
-              <w:rPr>
-                <w:b/>
+                <w:color w:val="1F3864"/>
+                <w:spacing w:val="-2"/>
+              </w:rPr>
+              <w:t xml:space="preserve"> </w:t>
+            </w:r>
+            <w:r>
+              <w:rPr>
+                <w:b/>
+                <w:color w:val="1F3864"/>
               </w:rPr>
               <w:t>the</w:t>
             </w:r>
             <w:r>
               <w:rPr>
                 <w:b/>
+                <w:color w:val="1F3864"/>
                 <w:spacing w:val="-5"/>
               </w:rPr>
               <w:t xml:space="preserve"> CSP</w:t>
@@ -158,6 +190,8 @@
         <w:tc>
           <w:tcPr>
             <w:tcW w:w="4076" w:type="dxa"/>
+            <w:shd w:val="clear" w:color="auto" w:fill="EEF3FA"/>
+            <w:vAlign w:val="center"/>
           </w:tcPr>
           <w:p>
             <w:pPr>
@@ -170,12 +204,14 @@
             <w:r>
               <w:rPr>
                 <w:b/>
+                <w:color w:val="1F3864"/>
               </w:rPr>
               <w:t>National</w:t>
             </w:r>
             <w:r>
               <w:rPr>
                 <w:b/>
+                <w:color w:val="1F3864"/>
                 <w:spacing w:val="41"/>
               </w:rPr>
               <w:t xml:space="preserve"> </w:t>
@@ -183,12 +219,14 @@
             <w:r>
               <w:rPr>
                 <w:b/>
+                <w:color w:val="1F3864"/>
               </w:rPr>
               <w:t>BC</w:t>
             </w:r>
             <w:r>
               <w:rPr>
                 <w:b/>
+                <w:color w:val="1F3864"/>
                 <w:spacing w:val="-4"/>
               </w:rPr>
               <w:t xml:space="preserve"> Name</w:t>
@@ -212,7 +250,19 @@
               <w:rPr>
                 <w:b/>
               </w:rPr>
-              <w:t>Eko Bharat ventures Pvt Ltd</w:t>
+              <w:t xml:space="preserve">Eko Bharat </w:t>
+            </w:r>
+            <w:r>
+              <w:rPr>
+                <w:b/>
+              </w:rPr>
+              <w:t>Ventures</w:t>
+            </w:r>
+            <w:r>
+              <w:rPr>
+                <w:b/>
+              </w:rPr>
+              <w:t xml:space="preserve"> Pvt Ltd</w:t>
             </w:r>
           </w:p>
         </w:tc>
@@ -224,6 +274,8 @@
         <w:tc>
           <w:tcPr>
             <w:tcW w:w="4076" w:type="dxa"/>
+            <w:shd w:val="clear" w:color="auto" w:fill="EEF3FA"/>
+            <w:vAlign w:val="center"/>
           </w:tcPr>
           <w:p>
             <w:pPr>
@@ -236,19 +288,22 @@
             <w:r>
               <w:rPr>
                 <w:b/>
+                <w:color w:val="1F3864"/>
               </w:rPr>
               <w:t>BC</w:t>
             </w:r>
             <w:r>
               <w:rPr>
                 <w:b/>
-                <w:spacing w:val="-2"/>
-              </w:rPr>
-              <w:t xml:space="preserve"> </w:t>
-            </w:r>
-            <w:r>
-              <w:rPr>
-                <w:b/>
+                <w:color w:val="1F3864"/>
+                <w:spacing w:val="-2"/>
+              </w:rPr>
+              <w:t xml:space="preserve"> </w:t>
+            </w:r>
+            <w:r>
+              <w:rPr>
+                <w:b/>
+                <w:color w:val="1F3864"/>
                 <w:spacing w:val="-4"/>
               </w:rPr>
               <w:t>Code</w:t>
@@ -287,6 +342,8 @@
         <w:tc>
           <w:tcPr>
             <w:tcW w:w="4076" w:type="dxa"/>
+            <w:shd w:val="clear" w:color="auto" w:fill="EEF3FA"/>
+            <w:vAlign w:val="center"/>
           </w:tcPr>
           <w:p>
             <w:pPr>
@@ -299,12 +356,14 @@
             <w:r>
               <w:rPr>
                 <w:b/>
+                <w:color w:val="1F3864"/>
               </w:rPr>
               <w:t>CSP</w:t>
             </w:r>
             <w:r>
               <w:rPr>
                 <w:b/>
+                <w:color w:val="1F3864"/>
                 <w:spacing w:val="-4"/>
               </w:rPr>
               <w:t xml:space="preserve"> </w:t>
@@ -312,12 +371,14 @@
             <w:r>
               <w:rPr>
                 <w:b/>
+                <w:color w:val="1F3864"/>
               </w:rPr>
               <w:t>KO</w:t>
             </w:r>
             <w:r>
               <w:rPr>
                 <w:b/>
+                <w:color w:val="1F3864"/>
                 <w:spacing w:val="-1"/>
               </w:rPr>
               <w:t xml:space="preserve"> </w:t>
@@ -325,6 +386,7 @@
             <w:r>
               <w:rPr>
                 <w:b/>
+                <w:color w:val="1F3864"/>
                 <w:spacing w:val="-4"/>
               </w:rPr>
               <w:t>Code</w:t>
@@ -369,6 +431,8 @@
         <w:tc>
           <w:tcPr>
             <w:tcW w:w="4076" w:type="dxa"/>
+            <w:shd w:val="clear" w:color="auto" w:fill="EEF3FA"/>
+            <w:vAlign w:val="center"/>
           </w:tcPr>
           <w:p>
             <w:pPr>
@@ -381,12 +445,14 @@
             <w:r>
               <w:rPr>
                 <w:b/>
+                <w:color w:val="1F3864"/>
               </w:rPr>
               <w:t>Link</w:t>
             </w:r>
             <w:r>
               <w:rPr>
                 <w:b/>
+                <w:color w:val="1F3864"/>
                 <w:spacing w:val="-5"/>
               </w:rPr>
               <w:t xml:space="preserve"> </w:t>
@@ -394,12 +460,14 @@
             <w:r>
               <w:rPr>
                 <w:b/>
+                <w:color w:val="1F3864"/>
               </w:rPr>
               <w:t>Branch</w:t>
             </w:r>
             <w:r>
               <w:rPr>
                 <w:b/>
+                <w:color w:val="1F3864"/>
                 <w:spacing w:val="-4"/>
               </w:rPr>
               <w:t xml:space="preserve"> </w:t>
@@ -407,25 +475,29 @@
             <w:r>
               <w:rPr>
                 <w:b/>
+                <w:color w:val="1F3864"/>
               </w:rPr>
               <w:t>Name</w:t>
             </w:r>
             <w:r>
               <w:rPr>
                 <w:b/>
-                <w:spacing w:val="-2"/>
-              </w:rPr>
-              <w:t xml:space="preserve"> </w:t>
-            </w:r>
-            <w:r>
-              <w:rPr>
-                <w:b/>
+                <w:color w:val="1F3864"/>
+                <w:spacing w:val="-2"/>
+              </w:rPr>
+              <w:t xml:space="preserve"> </w:t>
+            </w:r>
+            <w:r>
+              <w:rPr>
+                <w:b/>
+                <w:color w:val="1F3864"/>
               </w:rPr>
               <w:t>&amp;</w:t>
             </w:r>
             <w:r>
               <w:rPr>
                 <w:b/>
+                <w:color w:val="1F3864"/>
                 <w:spacing w:val="-3"/>
               </w:rPr>
               <w:t xml:space="preserve"> </w:t>
@@ -433,6 +505,7 @@
             <w:r>
               <w:rPr>
                 <w:b/>
+                <w:color w:val="1F3864"/>
                 <w:spacing w:val="-4"/>
               </w:rPr>
               <w:t>Code</w:t>
@@ -462,6 +535,8 @@
         <w:tc>
           <w:tcPr>
             <w:tcW w:w="4076" w:type="dxa"/>
+            <w:shd w:val="clear" w:color="auto" w:fill="EEF3FA"/>
+            <w:vAlign w:val="center"/>
           </w:tcPr>
           <w:p>
             <w:pPr>
@@ -474,6 +549,7 @@
             <w:r>
               <w:rPr>
                 <w:b/>
+                <w:color w:val="1F3864"/>
                 <w:spacing w:val="-2"/>
               </w:rPr>
               <w:t>Module</w:t>
@@ -509,6 +585,8 @@
         <w:tc>
           <w:tcPr>
             <w:tcW w:w="4076" w:type="dxa"/>
+            <w:shd w:val="clear" w:color="auto" w:fill="EEF3FA"/>
+            <w:vAlign w:val="center"/>
           </w:tcPr>
           <w:p>
             <w:pPr>
@@ -521,6 +599,7 @@
             <w:r>
               <w:rPr>
                 <w:b/>
+                <w:color w:val="1F3864"/>
                 <w:spacing w:val="-2"/>
               </w:rPr>
               <w:t>RBO/DSH</w:t>
@@ -556,6 +635,8 @@
         <w:tc>
           <w:tcPr>
             <w:tcW w:w="4076" w:type="dxa"/>
+            <w:shd w:val="clear" w:color="auto" w:fill="EEF3FA"/>
+            <w:vAlign w:val="center"/>
           </w:tcPr>
           <w:p>
             <w:pPr>
@@ -568,12 +649,14 @@
             <w:r>
               <w:rPr>
                 <w:b/>
+                <w:color w:val="1F3864"/>
               </w:rPr>
               <w:t>CSP</w:t>
             </w:r>
             <w:r>
               <w:rPr>
                 <w:b/>
+                <w:color w:val="1F3864"/>
                 <w:spacing w:val="-6"/>
               </w:rPr>
               <w:t xml:space="preserve"> </w:t>
@@ -581,12 +664,14 @@
             <w:r>
               <w:rPr>
                 <w:b/>
+                <w:color w:val="1F3864"/>
               </w:rPr>
               <w:t>Location</w:t>
             </w:r>
             <w:r>
               <w:rPr>
                 <w:b/>
+                <w:color w:val="1F3864"/>
                 <w:spacing w:val="-5"/>
               </w:rPr>
               <w:t xml:space="preserve"> </w:t>
@@ -594,6 +679,7 @@
             <w:r>
               <w:rPr>
                 <w:b/>
+                <w:color w:val="1F3864"/>
                 <w:spacing w:val="-2"/>
               </w:rPr>
               <w:t>Address</w:t>
@@ -623,6 +709,8 @@
         <w:tc>
           <w:tcPr>
             <w:tcW w:w="4076" w:type="dxa"/>
+            <w:shd w:val="clear" w:color="auto" w:fill="EEF3FA"/>
+            <w:vAlign w:val="center"/>
           </w:tcPr>
           <w:p>
             <w:pPr>
@@ -635,12 +723,14 @@
             <w:r>
               <w:rPr>
                 <w:b/>
+                <w:color w:val="1F3864"/>
               </w:rPr>
               <w:t>CSP</w:t>
             </w:r>
             <w:r>
               <w:rPr>
                 <w:b/>
+                <w:color w:val="1F3864"/>
                 <w:spacing w:val="-3"/>
               </w:rPr>
               <w:t xml:space="preserve"> </w:t>
@@ -648,12 +738,14 @@
             <w:r>
               <w:rPr>
                 <w:b/>
+                <w:color w:val="1F3864"/>
               </w:rPr>
               <w:t>Contact</w:t>
             </w:r>
             <w:r>
               <w:rPr>
                 <w:b/>
+                <w:color w:val="1F3864"/>
                 <w:spacing w:val="-3"/>
               </w:rPr>
               <w:t xml:space="preserve"> </w:t>
@@ -661,6 +753,7 @@
             <w:r>
               <w:rPr>
                 <w:b/>
+                <w:color w:val="1F3864"/>
                 <w:spacing w:val="-2"/>
               </w:rPr>
               <w:t>Details</w:t>
@@ -690,6 +783,8 @@
         <w:tc>
           <w:tcPr>
             <w:tcW w:w="4076" w:type="dxa"/>
+            <w:shd w:val="clear" w:color="auto" w:fill="EEF3FA"/>
+            <w:vAlign w:val="center"/>
           </w:tcPr>
           <w:p>
             <w:pPr>
@@ -702,12 +797,14 @@
             <w:r>
               <w:rPr>
                 <w:b/>
+                <w:color w:val="1F3864"/>
               </w:rPr>
               <w:t>Email</w:t>
             </w:r>
             <w:r>
               <w:rPr>
                 <w:b/>
+                <w:color w:val="1F3864"/>
                 <w:spacing w:val="-3"/>
               </w:rPr>
               <w:t xml:space="preserve"> </w:t>
@@ -715,12 +812,14 @@
             <w:r>
               <w:rPr>
                 <w:b/>
+                <w:color w:val="1F3864"/>
               </w:rPr>
               <w:t>ID</w:t>
             </w:r>
             <w:r>
               <w:rPr>
                 <w:b/>
+                <w:color w:val="1F3864"/>
                 <w:spacing w:val="-4"/>
               </w:rPr>
               <w:t xml:space="preserve"> </w:t>
@@ -728,12 +827,14 @@
             <w:r>
               <w:rPr>
                 <w:b/>
+                <w:color w:val="1F3864"/>
               </w:rPr>
               <w:t>of</w:t>
             </w:r>
             <w:r>
               <w:rPr>
                 <w:b/>
+                <w:color w:val="1F3864"/>
                 <w:spacing w:val="-1"/>
               </w:rPr>
               <w:t xml:space="preserve"> </w:t>
@@ -741,6 +842,7 @@
             <w:r>
               <w:rPr>
                 <w:b/>
+                <w:color w:val="1F3864"/>
                 <w:spacing w:val="-5"/>
               </w:rPr>
               <w:t>CSP</w:t>
@@ -758,7 +860,13 @@
               <w:spacing w:line="248" w:lineRule="exact"/>
             </w:pPr>
             <w:r>
-              <w:t>“CSP Email Id”</w:t>
+              <w:t xml:space="preserve">“CSP Email </w:t>
+            </w:r>
+            <w:r>
+              <w:t>ID</w:t>
+            </w:r>
+            <w:r>
+              <w:t>”</w:t>
             </w:r>
           </w:p>
         </w:tc>
@@ -770,6 +878,8 @@
         <w:tc>
           <w:tcPr>
             <w:tcW w:w="4076" w:type="dxa"/>
+            <w:shd w:val="clear" w:color="auto" w:fill="EEF3FA"/>
+            <w:vAlign w:val="center"/>
           </w:tcPr>
           <w:p>
             <w:pPr>
@@ -782,12 +892,14 @@
             <w:r>
               <w:rPr>
                 <w:b/>
+                <w:color w:val="1F3864"/>
               </w:rPr>
               <w:t>CSP</w:t>
             </w:r>
             <w:r>
               <w:rPr>
                 <w:b/>
+                <w:color w:val="1F3864"/>
                 <w:spacing w:val="-8"/>
               </w:rPr>
               <w:t xml:space="preserve"> </w:t>
@@ -795,12 +907,14 @@
             <w:r>
               <w:rPr>
                 <w:b/>
+                <w:color w:val="1F3864"/>
               </w:rPr>
               <w:t>Operational</w:t>
             </w:r>
             <w:r>
               <w:rPr>
                 <w:b/>
+                <w:color w:val="1F3864"/>
                 <w:spacing w:val="-5"/>
               </w:rPr>
               <w:t xml:space="preserve"> </w:t>
@@ -808,6 +922,7 @@
             <w:r>
               <w:rPr>
                 <w:b/>
+                <w:color w:val="1F3864"/>
                 <w:spacing w:val="-4"/>
               </w:rPr>
               <w:t>Since</w:t>
@@ -824,14 +939,19 @@
               <w:pStyle w:val="TableParagraph"/>
               <w:spacing w:line="248" w:lineRule="exact"/>
             </w:pPr>
+            <w:proofErr w:type="gramStart"/>
             <w:r>
               <w:t>“</w:t>
             </w:r>
             <w:r>
-              <w:t>Making</w:t>
-            </w:r>
-            <w:r>
-              <w:t xml:space="preserve"> month, year</w:t>
+              <w:t xml:space="preserve"> Making</w:t>
+            </w:r>
+            <w:proofErr w:type="gramEnd"/>
+            <w:r>
+              <w:t xml:space="preserve"> Month</w:t>
+            </w:r>
+            <w:r>
+              <w:t>, year</w:t>
             </w:r>
             <w:r>
               <w:t>”</w:t>
@@ -847,23 +967,27 @@
           <w:tcPr>
             <w:tcW w:w="4076" w:type="dxa"/>
             <w:vMerge w:val="restart"/>
-          </w:tcPr>
-          <w:p>
-            <w:pPr>
-              <w:pStyle w:val="TableParagraph"/>
-              <w:rPr>
-                <w:b/>
-              </w:rPr>
-            </w:pPr>
-            <w:r>
-              <w:rPr>
-                <w:b/>
+            <w:shd w:val="clear" w:color="auto" w:fill="EEF3FA"/>
+            <w:vAlign w:val="center"/>
+          </w:tcPr>
+          <w:p>
+            <w:pPr>
+              <w:pStyle w:val="TableParagraph"/>
+              <w:rPr>
+                <w:b/>
+              </w:rPr>
+            </w:pPr>
+            <w:r>
+              <w:rPr>
+                <w:b/>
+                <w:color w:val="1F3864"/>
               </w:rPr>
               <w:t>No.</w:t>
             </w:r>
             <w:r>
               <w:rPr>
                 <w:b/>
+                <w:color w:val="1F3864"/>
                 <w:spacing w:val="-1"/>
               </w:rPr>
               <w:t xml:space="preserve"> </w:t>
@@ -871,12 +995,14 @@
             <w:r>
               <w:rPr>
                 <w:b/>
+                <w:color w:val="1F3864"/>
               </w:rPr>
               <w:t>of</w:t>
             </w:r>
             <w:r>
               <w:rPr>
                 <w:b/>
+                <w:color w:val="1F3864"/>
                 <w:spacing w:val="-1"/>
               </w:rPr>
               <w:t xml:space="preserve"> </w:t>
@@ -884,6 +1010,7 @@
             <w:r>
               <w:rPr>
                 <w:b/>
+                <w:color w:val="1F3864"/>
                 <w:spacing w:val="-2"/>
               </w:rPr>
               <w:t>Staff</w:t>
@@ -893,6 +1020,8 @@
         <w:tc>
           <w:tcPr>
             <w:tcW w:w="2309" w:type="dxa"/>
+            <w:shd w:val="clear" w:color="auto" w:fill="F2F2F2"/>
+            <w:vAlign w:val="center"/>
           </w:tcPr>
           <w:p>
             <w:pPr>
@@ -905,6 +1034,7 @@
             <w:r>
               <w:rPr>
                 <w:b/>
+                <w:color w:val="1F3864"/>
                 <w:spacing w:val="-4"/>
               </w:rPr>
               <w:t>Name</w:t>
@@ -914,6 +1044,8 @@
         <w:tc>
           <w:tcPr>
             <w:tcW w:w="1596" w:type="dxa"/>
+            <w:shd w:val="clear" w:color="auto" w:fill="F2F2F2"/>
+            <w:vAlign w:val="center"/>
           </w:tcPr>
           <w:p>
             <w:pPr>
@@ -926,6 +1058,7 @@
             <w:r>
               <w:rPr>
                 <w:b/>
+                <w:color w:val="1F3864"/>
                 <w:spacing w:val="-2"/>
               </w:rPr>
               <w:t>Designation</w:t>
@@ -935,6 +1068,8 @@
         <w:tc>
           <w:tcPr>
             <w:tcW w:w="1597" w:type="dxa"/>
+            <w:shd w:val="clear" w:color="auto" w:fill="F2F2F2"/>
+            <w:vAlign w:val="center"/>
           </w:tcPr>
           <w:p>
             <w:pPr>
@@ -947,12 +1082,14 @@
             <w:r>
               <w:rPr>
                 <w:b/>
+                <w:color w:val="1F3864"/>
               </w:rPr>
               <w:t>Contact</w:t>
             </w:r>
             <w:r>
               <w:rPr>
                 <w:b/>
+                <w:color w:val="1F3864"/>
                 <w:spacing w:val="-5"/>
               </w:rPr>
               <w:t xml:space="preserve"> No</w:t>
@@ -971,6 +1108,8 @@
             <w:tcBorders>
               <w:top w:val="nil"/>
             </w:tcBorders>
+            <w:shd w:val="clear" w:color="auto" w:fill="EEF3FA"/>
+            <w:vAlign w:val="center"/>
           </w:tcPr>
           <w:p>
             <w:pPr>
@@ -1038,6 +1177,8 @@
             <w:tcBorders>
               <w:top w:val="nil"/>
             </w:tcBorders>
+            <w:shd w:val="clear" w:color="auto" w:fill="EEF3FA"/>
+            <w:vAlign w:val="center"/>
           </w:tcPr>
           <w:p>
             <w:pPr>
@@ -1133,12 +1274,12 @@
         <w:tblW w:w="0" w:type="auto"/>
         <w:tblInd w:w="257" w:type="dxa"/>
         <w:tblBorders>
-          <w:top w:val="single" w:sz="4" w:space="0" w:color="000000"/>
-          <w:left w:val="single" w:sz="4" w:space="0" w:color="000000"/>
-          <w:bottom w:val="single" w:sz="4" w:space="0" w:color="000000"/>
-          <w:right w:val="single" w:sz="4" w:space="0" w:color="000000"/>
-          <w:insideH w:val="single" w:sz="4" w:space="0" w:color="000000"/>
-          <w:insideV w:val="single" w:sz="4" w:space="0" w:color="000000"/>
+          <w:top w:val="single" w:sz="4" w:space="0" w:color="8FA3BF"/>
+          <w:left w:val="single" w:sz="4" w:space="0" w:color="8FA3BF"/>
+          <w:bottom w:val="single" w:sz="4" w:space="0" w:color="8FA3BF"/>
+          <w:right w:val="single" w:sz="4" w:space="0" w:color="8FA3BF"/>
+          <w:insideH w:val="single" w:sz="4" w:space="0" w:color="8FA3BF"/>
+          <w:insideV w:val="single" w:sz="4" w:space="0" w:color="8FA3BF"/>
         </w:tblBorders>
         <w:tblLayout w:type="fixed"/>
         <w:tblCellMar>
@@ -1163,6 +1304,8 @@
         <w:tc>
           <w:tcPr>
             <w:tcW w:w="523" w:type="dxa"/>
+            <w:shd w:val="clear" w:color="auto" w:fill="1F3864"/>
+            <w:vAlign w:val="center"/>
           </w:tcPr>
           <w:p>
             <w:pPr>
@@ -1175,6 +1318,7 @@
             <w:r>
               <w:rPr>
                 <w:b/>
+                <w:color w:val="FFFFFF"/>
                 <w:spacing w:val="-10"/>
               </w:rPr>
               <w:t>A</w:t>
@@ -1184,6 +1328,8 @@
         <w:tc>
           <w:tcPr>
             <w:tcW w:w="2256" w:type="dxa"/>
+            <w:shd w:val="clear" w:color="auto" w:fill="1F3864"/>
+            <w:vAlign w:val="center"/>
           </w:tcPr>
           <w:p>
             <w:pPr>
@@ -1197,12 +1343,14 @@
             <w:r>
               <w:rPr>
                 <w:b/>
+                <w:color w:val="FFFFFF"/>
               </w:rPr>
               <w:t>Element</w:t>
             </w:r>
             <w:r>
               <w:rPr>
                 <w:b/>
+                <w:color w:val="FFFFFF"/>
                 <w:spacing w:val="-5"/>
               </w:rPr>
               <w:t xml:space="preserve"> </w:t>
@@ -1210,6 +1358,7 @@
             <w:r>
               <w:rPr>
                 <w:b/>
+                <w:color w:val="FFFFFF"/>
                 <w:spacing w:val="-2"/>
               </w:rPr>
               <w:t>(Personnel)</w:t>
@@ -1220,6 +1369,8 @@
           <w:tcPr>
             <w:tcW w:w="5408" w:type="dxa"/>
             <w:gridSpan w:val="3"/>
+            <w:shd w:val="clear" w:color="auto" w:fill="1F3864"/>
+            <w:vAlign w:val="center"/>
           </w:tcPr>
           <w:p>
             <w:pPr>
@@ -1234,6 +1385,7 @@
             <w:r>
               <w:rPr>
                 <w:b/>
+                <w:color w:val="FFFFFF"/>
                 <w:spacing w:val="-2"/>
               </w:rPr>
               <w:t>Description</w:t>
@@ -1243,6 +1395,8 @@
         <w:tc>
           <w:tcPr>
             <w:tcW w:w="708" w:type="dxa"/>
+            <w:shd w:val="clear" w:color="auto" w:fill="1F3864"/>
+            <w:vAlign w:val="center"/>
           </w:tcPr>
           <w:p>
             <w:pPr>
@@ -1257,6 +1411,7 @@
             <w:r>
               <w:rPr>
                 <w:b/>
+                <w:color w:val="FFFFFF"/>
                 <w:spacing w:val="-10"/>
               </w:rPr>
               <w:t>Y</w:t>
@@ -1266,6 +1421,8 @@
         <w:tc>
           <w:tcPr>
             <w:tcW w:w="679" w:type="dxa"/>
+            <w:shd w:val="clear" w:color="auto" w:fill="1F3864"/>
+            <w:vAlign w:val="center"/>
           </w:tcPr>
           <w:p>
             <w:pPr>
@@ -1280,6 +1437,7 @@
             <w:r>
               <w:rPr>
                 <w:b/>
+                <w:color w:val="FFFFFF"/>
                 <w:spacing w:val="-10"/>
               </w:rPr>
               <w:t>N</w:t>
@@ -1607,6 +1765,9 @@
               <w:t>person</w:t>
             </w:r>
             <w:r>
+              <w:t>,</w:t>
+            </w:r>
+            <w:r>
               <w:rPr>
                 <w:spacing w:val="-2"/>
               </w:rPr>
@@ -1632,6 +1793,9 @@
             </w:r>
             <w:r>
               <w:t>KO/Operator</w:t>
+            </w:r>
+            <w:r>
+              <w:t>,</w:t>
             </w:r>
             <w:r>
               <w:rPr>
@@ -1714,6 +1878,12 @@
                 <w:spacing w:val="-4"/>
               </w:rPr>
               <w:t xml:space="preserve"> </w:t>
+            </w:r>
+            <w:r>
+              <w:rPr>
+                <w:spacing w:val="-4"/>
+              </w:rPr>
+              <w:t xml:space="preserve">the </w:t>
             </w:r>
             <w:r>
               <w:t>main</w:t>
@@ -1954,6 +2124,8 @@
         <w:tc>
           <w:tcPr>
             <w:tcW w:w="523" w:type="dxa"/>
+            <w:shd w:val="clear" w:color="auto" w:fill="DCE6F2"/>
+            <w:vAlign w:val="center"/>
           </w:tcPr>
           <w:p>
             <w:pPr>
@@ -1966,6 +2138,7 @@
             <w:r>
               <w:rPr>
                 <w:b/>
+                <w:color w:val="1F3864"/>
                 <w:spacing w:val="-10"/>
               </w:rPr>
               <w:t>B</w:t>
@@ -1975,6 +2148,8 @@
         <w:tc>
           <w:tcPr>
             <w:tcW w:w="2256" w:type="dxa"/>
+            <w:shd w:val="clear" w:color="auto" w:fill="DCE6F2"/>
+            <w:vAlign w:val="center"/>
           </w:tcPr>
           <w:p>
             <w:pPr>
@@ -1988,12 +2163,14 @@
             <w:r>
               <w:rPr>
                 <w:b/>
+                <w:color w:val="1F3864"/>
               </w:rPr>
               <w:t>Element</w:t>
             </w:r>
             <w:r>
               <w:rPr>
                 <w:b/>
+                <w:color w:val="1F3864"/>
                 <w:spacing w:val="-5"/>
               </w:rPr>
               <w:t xml:space="preserve"> </w:t>
@@ -2001,6 +2178,7 @@
             <w:r>
               <w:rPr>
                 <w:b/>
+                <w:color w:val="1F3864"/>
                 <w:spacing w:val="-2"/>
               </w:rPr>
               <w:t>(Material)</w:t>
@@ -2011,6 +2189,8 @@
           <w:tcPr>
             <w:tcW w:w="5408" w:type="dxa"/>
             <w:gridSpan w:val="3"/>
+            <w:shd w:val="clear" w:color="auto" w:fill="DCE6F2"/>
+            <w:vAlign w:val="center"/>
           </w:tcPr>
           <w:p>
             <w:pPr>
@@ -2019,25 +2199,39 @@
               <w:ind w:left="108"/>
             </w:pPr>
             <w:r>
+              <w:rPr>
+                <w:b/>
+                <w:color w:val="1F3864"/>
+              </w:rPr>
               <w:t>Standby</w:t>
             </w:r>
             <w:r>
               <w:rPr>
+                <w:b/>
+                <w:color w:val="1F3864"/>
                 <w:spacing w:val="-8"/>
               </w:rPr>
               <w:t xml:space="preserve"> </w:t>
             </w:r>
             <w:r>
+              <w:rPr>
+                <w:b/>
+                <w:color w:val="1F3864"/>
+              </w:rPr>
               <w:t>Arrangements</w:t>
             </w:r>
             <w:r>
               <w:rPr>
+                <w:b/>
+                <w:color w:val="1F3864"/>
                 <w:spacing w:val="-8"/>
               </w:rPr>
               <w:t xml:space="preserve"> </w:t>
             </w:r>
             <w:r>
               <w:rPr>
+                <w:b/>
+                <w:color w:val="1F3864"/>
                 <w:spacing w:val="-5"/>
               </w:rPr>
               <w:t>For</w:t>
@@ -2047,6 +2241,8 @@
         <w:tc>
           <w:tcPr>
             <w:tcW w:w="708" w:type="dxa"/>
+            <w:shd w:val="clear" w:color="auto" w:fill="DCE6F2"/>
+            <w:vAlign w:val="center"/>
           </w:tcPr>
           <w:p>
             <w:pPr>
@@ -2062,6 +2258,8 @@
         <w:tc>
           <w:tcPr>
             <w:tcW w:w="679" w:type="dxa"/>
+            <w:shd w:val="clear" w:color="auto" w:fill="DCE6F2"/>
+            <w:vAlign w:val="center"/>
           </w:tcPr>
           <w:p>
             <w:pPr>
@@ -2757,7 +2955,13 @@
               <w:rPr>
                 <w:b/>
               </w:rPr>
-              <w:t>System,</w:t>
+              <w:t>the system</w:t>
+            </w:r>
+            <w:r>
+              <w:rPr>
+                <w:b/>
+              </w:rPr>
+              <w:t>,</w:t>
             </w:r>
             <w:r>
               <w:rPr>
@@ -2870,6 +3074,8 @@
         <w:tc>
           <w:tcPr>
             <w:tcW w:w="1802" w:type="dxa"/>
+            <w:shd w:val="clear" w:color="auto" w:fill="F2F2F2"/>
+            <w:vAlign w:val="center"/>
           </w:tcPr>
           <w:p>
             <w:pPr>
@@ -2882,19 +3088,22 @@
             <w:r>
               <w:rPr>
                 <w:b/>
+                <w:color w:val="1F3864"/>
               </w:rPr>
               <w:t>CSP</w:t>
             </w:r>
             <w:r>
               <w:rPr>
                 <w:b/>
-                <w:spacing w:val="-2"/>
-              </w:rPr>
-              <w:t xml:space="preserve"> </w:t>
-            </w:r>
-            <w:r>
-              <w:rPr>
-                <w:b/>
+                <w:color w:val="1F3864"/>
+                <w:spacing w:val="-2"/>
+              </w:rPr>
+              <w:t xml:space="preserve"> </w:t>
+            </w:r>
+            <w:r>
+              <w:rPr>
+                <w:b/>
+                <w:color w:val="1F3864"/>
                 <w:spacing w:val="-4"/>
               </w:rPr>
               <w:t>Name</w:t>
@@ -2904,6 +3113,8 @@
         <w:tc>
           <w:tcPr>
             <w:tcW w:w="1802" w:type="dxa"/>
+            <w:shd w:val="clear" w:color="auto" w:fill="F2F2F2"/>
+            <w:vAlign w:val="center"/>
           </w:tcPr>
           <w:p>
             <w:pPr>
@@ -2916,6 +3127,7 @@
             <w:r>
               <w:rPr>
                 <w:b/>
+                <w:color w:val="1F3864"/>
                 <w:spacing w:val="-2"/>
               </w:rPr>
               <w:t>Address</w:t>
@@ -2925,6 +3137,8 @@
         <w:tc>
           <w:tcPr>
             <w:tcW w:w="1804" w:type="dxa"/>
+            <w:shd w:val="clear" w:color="auto" w:fill="F2F2F2"/>
+            <w:vAlign w:val="center"/>
           </w:tcPr>
           <w:p>
             <w:pPr>
@@ -2937,12 +3151,14 @@
             <w:r>
               <w:rPr>
                 <w:b/>
+                <w:color w:val="1F3864"/>
               </w:rPr>
               <w:t>Phone</w:t>
             </w:r>
             <w:r>
               <w:rPr>
                 <w:b/>
+                <w:color w:val="1F3864"/>
                 <w:spacing w:val="-5"/>
               </w:rPr>
               <w:t xml:space="preserve"> </w:t>
@@ -2950,6 +3166,7 @@
             <w:r>
               <w:rPr>
                 <w:b/>
+                <w:color w:val="1F3864"/>
                 <w:spacing w:val="-2"/>
               </w:rPr>
               <w:t>Number</w:t>
@@ -3108,60 +3325,74 @@
       </w:tr>
     </w:tbl>
     <w:p/>
-    <w:p/>
-    <w:p/>
-    <w:p/>
-    <w:p/>
-    <w:p/>
     <w:p>
       <w:pPr>
         <w:pStyle w:val="BodyText"/>
+        <w:pageBreakBefore/>
+        <w:pBdr>
+          <w:left w:val="single" w:sz="24" w:space="6" w:color="FFA700"/>
+        </w:pBdr>
         <w:spacing w:before="37"/>
-        <w:ind w:left="360"/>
+        <w:ind w:left="400"/>
       </w:pPr>
       <w:r>
         <w:rPr>
-          <w:u w:val="single"/>
+          <w:rFonts w:ascii="Arial" w:hAnsi="Arial" w:cs="Arial"/>
+          <w:b/>
+          <w:color w:val="1F3864"/>
         </w:rPr>
+        <w:lastRenderedPageBreak/>
         <w:t>Complaint</w:t>
       </w:r>
       <w:r>
         <w:rPr>
+          <w:rFonts w:ascii="Arial" w:hAnsi="Arial" w:cs="Arial"/>
+          <w:b/>
+          <w:color w:val="1F3864"/>
           <w:spacing w:val="-11"/>
-          <w:u w:val="single"/>
         </w:rPr>
         <w:t xml:space="preserve"> </w:t>
       </w:r>
       <w:r>
         <w:rPr>
-          <w:u w:val="single"/>
+          <w:rFonts w:ascii="Arial" w:hAnsi="Arial" w:cs="Arial"/>
+          <w:b/>
+          <w:color w:val="1F3864"/>
         </w:rPr>
         <w:t>/</w:t>
       </w:r>
       <w:r>
         <w:rPr>
+          <w:rFonts w:ascii="Arial" w:hAnsi="Arial" w:cs="Arial"/>
+          <w:b/>
+          <w:color w:val="1F3864"/>
           <w:spacing w:val="-10"/>
-          <w:u w:val="single"/>
         </w:rPr>
         <w:t xml:space="preserve"> </w:t>
       </w:r>
       <w:r>
         <w:rPr>
-          <w:u w:val="single"/>
+          <w:rFonts w:ascii="Arial" w:hAnsi="Arial" w:cs="Arial"/>
+          <w:b/>
+          <w:color w:val="1F3864"/>
         </w:rPr>
         <w:t>Escalation</w:t>
       </w:r>
       <w:r>
         <w:rPr>
+          <w:rFonts w:ascii="Arial" w:hAnsi="Arial" w:cs="Arial"/>
+          <w:b/>
+          <w:color w:val="1F3864"/>
           <w:spacing w:val="-9"/>
-          <w:u w:val="single"/>
         </w:rPr>
         <w:t xml:space="preserve"> </w:t>
       </w:r>
       <w:r>
         <w:rPr>
+          <w:rFonts w:ascii="Arial" w:hAnsi="Arial" w:cs="Arial"/>
+          <w:b/>
+          <w:color w:val="1F3864"/>
           <w:spacing w:val="-2"/>
-          <w:u w:val="single"/>
         </w:rPr>
         <w:t>Levels:</w:t>
       </w:r>
@@ -3180,12 +3411,12 @@
         <w:tblW w:w="0" w:type="auto"/>
         <w:tblInd w:w="257" w:type="dxa"/>
         <w:tblBorders>
-          <w:top w:val="single" w:sz="4" w:space="0" w:color="000000"/>
-          <w:left w:val="single" w:sz="4" w:space="0" w:color="000000"/>
-          <w:bottom w:val="single" w:sz="4" w:space="0" w:color="000000"/>
-          <w:right w:val="single" w:sz="4" w:space="0" w:color="000000"/>
-          <w:insideH w:val="single" w:sz="4" w:space="0" w:color="000000"/>
-          <w:insideV w:val="single" w:sz="4" w:space="0" w:color="000000"/>
+          <w:top w:val="single" w:sz="4" w:space="0" w:color="8FA3BF"/>
+          <w:left w:val="single" w:sz="4" w:space="0" w:color="8FA3BF"/>
+          <w:bottom w:val="single" w:sz="4" w:space="0" w:color="8FA3BF"/>
+          <w:right w:val="single" w:sz="4" w:space="0" w:color="8FA3BF"/>
+          <w:insideH w:val="single" w:sz="4" w:space="0" w:color="8FA3BF"/>
+          <w:insideV w:val="single" w:sz="4" w:space="0" w:color="8FA3BF"/>
         </w:tblBorders>
         <w:tblLayout w:type="fixed"/>
         <w:tblCellMar>
@@ -3208,17 +3439,20 @@
         <w:tc>
           <w:tcPr>
             <w:tcW w:w="478" w:type="dxa"/>
-          </w:tcPr>
-          <w:p>
-            <w:pPr>
-              <w:pStyle w:val="TableParagraph"/>
-              <w:rPr>
-                <w:b/>
-              </w:rPr>
-            </w:pPr>
-            <w:r>
-              <w:rPr>
-                <w:b/>
+            <w:shd w:val="clear" w:color="auto" w:fill="1F3864"/>
+            <w:vAlign w:val="center"/>
+          </w:tcPr>
+          <w:p>
+            <w:pPr>
+              <w:pStyle w:val="TableParagraph"/>
+              <w:rPr>
+                <w:b/>
+              </w:rPr>
+            </w:pPr>
+            <w:r>
+              <w:rPr>
+                <w:b/>
+                <w:color w:val="FFFFFF"/>
                 <w:spacing w:val="-10"/>
               </w:rPr>
               <w:t>A</w:t>
@@ -3228,17 +3462,20 @@
         <w:tc>
           <w:tcPr>
             <w:tcW w:w="1930" w:type="dxa"/>
-          </w:tcPr>
-          <w:p>
-            <w:pPr>
-              <w:pStyle w:val="TableParagraph"/>
-              <w:rPr>
-                <w:b/>
-              </w:rPr>
-            </w:pPr>
-            <w:r>
-              <w:rPr>
-                <w:b/>
+            <w:shd w:val="clear" w:color="auto" w:fill="1F3864"/>
+            <w:vAlign w:val="center"/>
+          </w:tcPr>
+          <w:p>
+            <w:pPr>
+              <w:pStyle w:val="TableParagraph"/>
+              <w:rPr>
+                <w:b/>
+              </w:rPr>
+            </w:pPr>
+            <w:r>
+              <w:rPr>
+                <w:b/>
+                <w:color w:val="FFFFFF"/>
                 <w:spacing w:val="-2"/>
               </w:rPr>
               <w:t>Complaint</w:t>
@@ -3255,6 +3492,7 @@
             <w:r>
               <w:rPr>
                 <w:b/>
+                <w:color w:val="FFFFFF"/>
                 <w:spacing w:val="-2"/>
               </w:rPr>
               <w:t>Escalations</w:t>
@@ -3264,6 +3502,8 @@
         <w:tc>
           <w:tcPr>
             <w:tcW w:w="2197" w:type="dxa"/>
+            <w:shd w:val="clear" w:color="auto" w:fill="1F3864"/>
+            <w:vAlign w:val="center"/>
           </w:tcPr>
           <w:p>
             <w:pPr>
@@ -3276,25 +3516,29 @@
             <w:r>
               <w:rPr>
                 <w:b/>
+                <w:color w:val="FFFFFF"/>
               </w:rPr>
               <w:t>Name</w:t>
             </w:r>
             <w:r>
               <w:rPr>
                 <w:b/>
-                <w:spacing w:val="-2"/>
-              </w:rPr>
-              <w:t xml:space="preserve"> </w:t>
-            </w:r>
-            <w:r>
-              <w:rPr>
-                <w:b/>
+                <w:color w:val="FFFFFF"/>
+                <w:spacing w:val="-2"/>
+              </w:rPr>
+              <w:t xml:space="preserve"> </w:t>
+            </w:r>
+            <w:r>
+              <w:rPr>
+                <w:b/>
+                <w:color w:val="FFFFFF"/>
               </w:rPr>
               <w:t>&amp;</w:t>
             </w:r>
             <w:r>
               <w:rPr>
                 <w:b/>
+                <w:color w:val="FFFFFF"/>
                 <w:spacing w:val="-3"/>
               </w:rPr>
               <w:t xml:space="preserve"> </w:t>
@@ -3302,6 +3546,7 @@
             <w:r>
               <w:rPr>
                 <w:b/>
+                <w:color w:val="FFFFFF"/>
                 <w:spacing w:val="-2"/>
               </w:rPr>
               <w:t>Designation</w:t>
@@ -3311,6 +3556,8 @@
         <w:tc>
           <w:tcPr>
             <w:tcW w:w="3507" w:type="dxa"/>
+            <w:shd w:val="clear" w:color="auto" w:fill="1F3864"/>
+            <w:vAlign w:val="center"/>
           </w:tcPr>
           <w:p>
             <w:pPr>
@@ -3324,6 +3571,7 @@
             <w:r>
               <w:rPr>
                 <w:b/>
+                <w:color w:val="FFFFFF"/>
                 <w:spacing w:val="-4"/>
               </w:rPr>
               <w:t>Email</w:t>
@@ -3333,6 +3581,8 @@
         <w:tc>
           <w:tcPr>
             <w:tcW w:w="1467" w:type="dxa"/>
+            <w:shd w:val="clear" w:color="auto" w:fill="1F3864"/>
+            <w:vAlign w:val="center"/>
           </w:tcPr>
           <w:p>
             <w:pPr>
@@ -3346,12 +3596,14 @@
             <w:r>
               <w:rPr>
                 <w:b/>
+                <w:color w:val="FFFFFF"/>
               </w:rPr>
               <w:t>Contact</w:t>
             </w:r>
             <w:r>
               <w:rPr>
                 <w:b/>
+                <w:color w:val="FFFFFF"/>
                 <w:spacing w:val="-5"/>
               </w:rPr>
               <w:t xml:space="preserve"> No</w:t>
@@ -3430,16 +3682,6 @@
             </w:pPr>
             <w:r>
               <w:t>Complaint</w:t>
-            </w:r>
-            <w:r>
-              <w:rPr>
-                <w:spacing w:val="56"/>
-                <w:w w:val="150"/>
-              </w:rPr>
-              <w:t xml:space="preserve"> </w:t>
-            </w:r>
-            <w:r>
-              <w:t>on</w:t>
             </w:r>
             <w:r>
               <w:rPr>
@@ -3811,118 +4053,155 @@
     <w:p>
       <w:pPr>
         <w:pStyle w:val="BodyText"/>
-        <w:ind w:left="360"/>
+        <w:pBdr>
+          <w:left w:val="single" w:sz="24" w:space="6" w:color="FFA700"/>
+        </w:pBdr>
+        <w:ind w:left="400"/>
       </w:pPr>
       <w:r>
         <w:rPr>
-          <w:u w:val="single"/>
+          <w:rFonts w:ascii="Arial" w:hAnsi="Arial" w:cs="Arial"/>
+          <w:b/>
+          <w:color w:val="1F3864"/>
         </w:rPr>
         <w:t>Nature</w:t>
       </w:r>
       <w:r>
         <w:rPr>
+          <w:rFonts w:ascii="Arial" w:hAnsi="Arial" w:cs="Arial"/>
+          <w:b/>
+          <w:color w:val="1F3864"/>
           <w:spacing w:val="-8"/>
-          <w:u w:val="single"/>
         </w:rPr>
         <w:t xml:space="preserve"> </w:t>
       </w:r>
       <w:r>
         <w:rPr>
-          <w:u w:val="single"/>
+          <w:rFonts w:ascii="Arial" w:hAnsi="Arial" w:cs="Arial"/>
+          <w:b/>
+          <w:color w:val="1F3864"/>
         </w:rPr>
         <w:t>of</w:t>
       </w:r>
       <w:r>
         <w:rPr>
+          <w:rFonts w:ascii="Arial" w:hAnsi="Arial" w:cs="Arial"/>
+          <w:b/>
+          <w:color w:val="1F3864"/>
           <w:spacing w:val="-7"/>
-          <w:u w:val="single"/>
         </w:rPr>
         <w:t xml:space="preserve"> </w:t>
       </w:r>
       <w:r>
         <w:rPr>
-          <w:u w:val="single"/>
+          <w:rFonts w:ascii="Arial" w:hAnsi="Arial" w:cs="Arial"/>
+          <w:b/>
+          <w:color w:val="1F3864"/>
         </w:rPr>
         <w:t>Complaint</w:t>
       </w:r>
       <w:r>
         <w:rPr>
+          <w:rFonts w:ascii="Arial" w:hAnsi="Arial" w:cs="Arial"/>
+          <w:b/>
+          <w:color w:val="1F3864"/>
           <w:spacing w:val="-6"/>
-          <w:u w:val="single"/>
         </w:rPr>
         <w:t xml:space="preserve"> </w:t>
       </w:r>
       <w:r>
         <w:rPr>
-          <w:u w:val="single"/>
+          <w:rFonts w:ascii="Arial" w:hAnsi="Arial" w:cs="Arial"/>
+          <w:b/>
+          <w:color w:val="1F3864"/>
         </w:rPr>
         <w:t>&amp;</w:t>
       </w:r>
       <w:r>
         <w:rPr>
+          <w:rFonts w:ascii="Arial" w:hAnsi="Arial" w:cs="Arial"/>
+          <w:b/>
+          <w:color w:val="1F3864"/>
           <w:spacing w:val="-6"/>
-          <w:u w:val="single"/>
         </w:rPr>
         <w:t xml:space="preserve"> </w:t>
       </w:r>
       <w:r>
         <w:rPr>
-          <w:u w:val="single"/>
+          <w:rFonts w:ascii="Arial" w:hAnsi="Arial" w:cs="Arial"/>
+          <w:b/>
+          <w:color w:val="1F3864"/>
         </w:rPr>
         <w:t>Turn</w:t>
       </w:r>
       <w:r>
         <w:rPr>
+          <w:rFonts w:ascii="Arial" w:hAnsi="Arial" w:cs="Arial"/>
+          <w:b/>
+          <w:color w:val="1F3864"/>
           <w:spacing w:val="-4"/>
-          <w:u w:val="single"/>
         </w:rPr>
         <w:t xml:space="preserve"> </w:t>
       </w:r>
       <w:r>
         <w:rPr>
-          <w:u w:val="single"/>
+          <w:rFonts w:ascii="Arial" w:hAnsi="Arial" w:cs="Arial"/>
+          <w:b/>
+          <w:color w:val="1F3864"/>
         </w:rPr>
         <w:t>Around</w:t>
       </w:r>
       <w:r>
         <w:rPr>
+          <w:rFonts w:ascii="Arial" w:hAnsi="Arial" w:cs="Arial"/>
+          <w:b/>
+          <w:color w:val="1F3864"/>
           <w:spacing w:val="-4"/>
-          <w:u w:val="single"/>
         </w:rPr>
         <w:t xml:space="preserve"> </w:t>
       </w:r>
       <w:r>
         <w:rPr>
-          <w:u w:val="single"/>
+          <w:rFonts w:ascii="Arial" w:hAnsi="Arial" w:cs="Arial"/>
+          <w:b/>
+          <w:color w:val="1F3864"/>
         </w:rPr>
         <w:t>Time</w:t>
       </w:r>
       <w:r>
         <w:rPr>
+          <w:rFonts w:ascii="Arial" w:hAnsi="Arial" w:cs="Arial"/>
+          <w:b/>
+          <w:color w:val="1F3864"/>
           <w:spacing w:val="-7"/>
-          <w:u w:val="single"/>
         </w:rPr>
         <w:t xml:space="preserve"> </w:t>
       </w:r>
       <w:proofErr w:type="gramStart"/>
       <w:r>
         <w:rPr>
-          <w:u w:val="single"/>
+          <w:rFonts w:ascii="Arial" w:hAnsi="Arial" w:cs="Arial"/>
+          <w:b/>
+          <w:color w:val="1F3864"/>
         </w:rPr>
         <w:t>For</w:t>
       </w:r>
       <w:proofErr w:type="gramEnd"/>
       <w:r>
         <w:rPr>
+          <w:rFonts w:ascii="Arial" w:hAnsi="Arial" w:cs="Arial"/>
+          <w:b/>
+          <w:color w:val="1F3864"/>
           <w:spacing w:val="-6"/>
-          <w:u w:val="single"/>
         </w:rPr>
         <w:t xml:space="preserve"> </w:t>
       </w:r>
       <w:r>
         <w:rPr>
+          <w:rFonts w:ascii="Arial" w:hAnsi="Arial" w:cs="Arial"/>
+          <w:b/>
+          <w:color w:val="1F3864"/>
           <w:spacing w:val="-2"/>
-          <w:u w:val="single"/>
         </w:rPr>
         <w:t>Recovery:</w:t>
       </w:r>
@@ -3941,12 +4220,12 @@
         <w:tblW w:w="0" w:type="auto"/>
         <w:tblInd w:w="257" w:type="dxa"/>
         <w:tblBorders>
-          <w:top w:val="single" w:sz="4" w:space="0" w:color="000000"/>
-          <w:left w:val="single" w:sz="4" w:space="0" w:color="000000"/>
-          <w:bottom w:val="single" w:sz="4" w:space="0" w:color="000000"/>
-          <w:right w:val="single" w:sz="4" w:space="0" w:color="000000"/>
-          <w:insideH w:val="single" w:sz="4" w:space="0" w:color="000000"/>
-          <w:insideV w:val="single" w:sz="4" w:space="0" w:color="000000"/>
+          <w:top w:val="single" w:sz="4" w:space="0" w:color="8FA3BF"/>
+          <w:left w:val="single" w:sz="4" w:space="0" w:color="8FA3BF"/>
+          <w:bottom w:val="single" w:sz="4" w:space="0" w:color="8FA3BF"/>
+          <w:right w:val="single" w:sz="4" w:space="0" w:color="8FA3BF"/>
+          <w:insideH w:val="single" w:sz="4" w:space="0" w:color="8FA3BF"/>
+          <w:insideV w:val="single" w:sz="4" w:space="0" w:color="8FA3BF"/>
         </w:tblBorders>
         <w:tblLayout w:type="fixed"/>
         <w:tblCellMar>
@@ -3969,6 +4248,8 @@
         <w:tc>
           <w:tcPr>
             <w:tcW w:w="674" w:type="dxa"/>
+            <w:shd w:val="clear" w:color="auto" w:fill="1F3864"/>
+            <w:vAlign w:val="center"/>
           </w:tcPr>
           <w:p>
             <w:pPr>
@@ -3983,6 +4264,8 @@
         <w:tc>
           <w:tcPr>
             <w:tcW w:w="2837" w:type="dxa"/>
+            <w:shd w:val="clear" w:color="auto" w:fill="1F3864"/>
+            <w:vAlign w:val="center"/>
           </w:tcPr>
           <w:p>
             <w:pPr>
@@ -3995,12 +4278,14 @@
             <w:r>
               <w:rPr>
                 <w:b/>
+                <w:color w:val="FFFFFF"/>
               </w:rPr>
               <w:t>Type</w:t>
             </w:r>
             <w:r>
               <w:rPr>
                 <w:b/>
+                <w:color w:val="FFFFFF"/>
                 <w:spacing w:val="-3"/>
               </w:rPr>
               <w:t xml:space="preserve"> </w:t>
@@ -4008,12 +4293,14 @@
             <w:r>
               <w:rPr>
                 <w:b/>
+                <w:color w:val="FFFFFF"/>
               </w:rPr>
               <w:t>of</w:t>
             </w:r>
             <w:r>
               <w:rPr>
                 <w:b/>
+                <w:color w:val="FFFFFF"/>
                 <w:spacing w:val="-2"/>
               </w:rPr>
               <w:t xml:space="preserve"> Complaint</w:t>
@@ -4023,6 +4310,8 @@
         <w:tc>
           <w:tcPr>
             <w:tcW w:w="2126" w:type="dxa"/>
+            <w:shd w:val="clear" w:color="auto" w:fill="1F3864"/>
+            <w:vAlign w:val="center"/>
           </w:tcPr>
           <w:p>
             <w:pPr>
@@ -4036,12 +4325,14 @@
             <w:r>
               <w:rPr>
                 <w:b/>
+                <w:color w:val="FFFFFF"/>
               </w:rPr>
               <w:t>Criticality</w:t>
             </w:r>
             <w:r>
               <w:rPr>
                 <w:b/>
+                <w:color w:val="FFFFFF"/>
                 <w:spacing w:val="-9"/>
               </w:rPr>
               <w:t xml:space="preserve"> </w:t>
@@ -4049,6 +4340,7 @@
             <w:r>
               <w:rPr>
                 <w:b/>
+                <w:color w:val="FFFFFF"/>
                 <w:spacing w:val="-2"/>
               </w:rPr>
               <w:t>Level</w:t>
@@ -4067,12 +4359,14 @@
             <w:r>
               <w:rPr>
                 <w:b/>
+                <w:color w:val="FFFFFF"/>
               </w:rPr>
               <w:t>High</w:t>
             </w:r>
             <w:r>
               <w:rPr>
                 <w:b/>
+                <w:color w:val="FFFFFF"/>
                 <w:spacing w:val="-3"/>
               </w:rPr>
               <w:t xml:space="preserve"> </w:t>
@@ -4080,6 +4374,7 @@
             <w:r>
               <w:rPr>
                 <w:b/>
+                <w:color w:val="FFFFFF"/>
                 <w:spacing w:val="-2"/>
               </w:rPr>
               <w:t>/Medium/Low</w:t>
@@ -4089,6 +4384,8 @@
         <w:tc>
           <w:tcPr>
             <w:tcW w:w="1701" w:type="dxa"/>
+            <w:shd w:val="clear" w:color="auto" w:fill="1F3864"/>
+            <w:vAlign w:val="center"/>
           </w:tcPr>
           <w:p>
             <w:pPr>
@@ -4102,12 +4399,14 @@
             <w:r>
               <w:rPr>
                 <w:b/>
+                <w:color w:val="FFFFFF"/>
               </w:rPr>
               <w:t>Recovery</w:t>
             </w:r>
             <w:r>
               <w:rPr>
                 <w:b/>
+                <w:color w:val="FFFFFF"/>
                 <w:spacing w:val="-11"/>
               </w:rPr>
               <w:t xml:space="preserve"> </w:t>
@@ -4115,6 +4414,7 @@
             <w:r>
               <w:rPr>
                 <w:b/>
+                <w:color w:val="FFFFFF"/>
                 <w:spacing w:val="-4"/>
               </w:rPr>
               <w:t>Time</w:t>
@@ -4133,12 +4433,14 @@
             <w:r>
               <w:rPr>
                 <w:b/>
+                <w:color w:val="FFFFFF"/>
               </w:rPr>
               <w:t>(in</w:t>
             </w:r>
             <w:r>
               <w:rPr>
                 <w:b/>
+                <w:color w:val="FFFFFF"/>
                 <w:spacing w:val="-1"/>
               </w:rPr>
               <w:t xml:space="preserve"> </w:t>
@@ -4146,6 +4448,7 @@
             <w:r>
               <w:rPr>
                 <w:b/>
+                <w:color w:val="FFFFFF"/>
                 <w:spacing w:val="-2"/>
               </w:rPr>
               <w:t>hours)</w:t>
@@ -4155,6 +4458,8 @@
         <w:tc>
           <w:tcPr>
             <w:tcW w:w="2237" w:type="dxa"/>
+            <w:shd w:val="clear" w:color="auto" w:fill="1F3864"/>
+            <w:vAlign w:val="center"/>
           </w:tcPr>
           <w:p>
             <w:pPr>
@@ -4168,6 +4473,7 @@
             <w:r>
               <w:rPr>
                 <w:b/>
+                <w:color w:val="FFFFFF"/>
                 <w:spacing w:val="-2"/>
               </w:rPr>
               <w:t>Maximum</w:t>
@@ -4186,12 +4492,14 @@
             <w:r>
               <w:rPr>
                 <w:b/>
+                <w:color w:val="FFFFFF"/>
               </w:rPr>
               <w:t>Permissible</w:t>
             </w:r>
             <w:r>
               <w:rPr>
                 <w:b/>
+                <w:color w:val="FFFFFF"/>
                 <w:spacing w:val="-13"/>
               </w:rPr>
               <w:t xml:space="preserve"> </w:t>
@@ -4199,6 +4507,7 @@
             <w:r>
               <w:rPr>
                 <w:b/>
+                <w:color w:val="FFFFFF"/>
                 <w:spacing w:val="-4"/>
               </w:rPr>
               <w:t>Time</w:t>
@@ -4364,6 +4673,7 @@
         <w:tc>
           <w:tcPr>
             <w:tcW w:w="674" w:type="dxa"/>
+            <w:shd w:val="clear" w:color="auto" w:fill="F7F9FC"/>
           </w:tcPr>
           <w:p>
             <w:pPr>
@@ -4384,6 +4694,7 @@
         <w:tc>
           <w:tcPr>
             <w:tcW w:w="2837" w:type="dxa"/>
+            <w:shd w:val="clear" w:color="auto" w:fill="F7F9FC"/>
           </w:tcPr>
           <w:p>
             <w:pPr>
@@ -4448,6 +4759,7 @@
         <w:tc>
           <w:tcPr>
             <w:tcW w:w="2126" w:type="dxa"/>
+            <w:shd w:val="clear" w:color="auto" w:fill="F7F9FC"/>
           </w:tcPr>
           <w:p>
             <w:pPr>
@@ -4465,6 +4777,7 @@
         <w:tc>
           <w:tcPr>
             <w:tcW w:w="1701" w:type="dxa"/>
+            <w:shd w:val="clear" w:color="auto" w:fill="F7F9FC"/>
           </w:tcPr>
           <w:p>
             <w:pPr>
@@ -4485,6 +4798,7 @@
         <w:tc>
           <w:tcPr>
             <w:tcW w:w="2237" w:type="dxa"/>
+            <w:shd w:val="clear" w:color="auto" w:fill="F7F9FC"/>
           </w:tcPr>
           <w:p>
             <w:pPr>
@@ -4657,6 +4971,7 @@
         <w:tc>
           <w:tcPr>
             <w:tcW w:w="674" w:type="dxa"/>
+            <w:shd w:val="clear" w:color="auto" w:fill="F7F9FC"/>
           </w:tcPr>
           <w:p>
             <w:pPr>
@@ -4677,6 +4992,7 @@
         <w:tc>
           <w:tcPr>
             <w:tcW w:w="2837" w:type="dxa"/>
+            <w:shd w:val="clear" w:color="auto" w:fill="F7F9FC"/>
           </w:tcPr>
           <w:p>
             <w:pPr>
@@ -4744,6 +5060,7 @@
         <w:tc>
           <w:tcPr>
             <w:tcW w:w="2126" w:type="dxa"/>
+            <w:shd w:val="clear" w:color="auto" w:fill="F7F9FC"/>
           </w:tcPr>
           <w:p>
             <w:pPr>
@@ -4761,6 +5078,7 @@
         <w:tc>
           <w:tcPr>
             <w:tcW w:w="1701" w:type="dxa"/>
+            <w:shd w:val="clear" w:color="auto" w:fill="F7F9FC"/>
           </w:tcPr>
           <w:p>
             <w:pPr>
@@ -4781,6 +5099,7 @@
         <w:tc>
           <w:tcPr>
             <w:tcW w:w="2237" w:type="dxa"/>
+            <w:shd w:val="clear" w:color="auto" w:fill="F7F9FC"/>
           </w:tcPr>
           <w:p>
             <w:pPr>
@@ -4925,6 +5244,7 @@
         <w:tc>
           <w:tcPr>
             <w:tcW w:w="674" w:type="dxa"/>
+            <w:shd w:val="clear" w:color="auto" w:fill="F7F9FC"/>
           </w:tcPr>
           <w:p>
             <w:pPr>
@@ -4946,6 +5266,7 @@
         <w:tc>
           <w:tcPr>
             <w:tcW w:w="2837" w:type="dxa"/>
+            <w:shd w:val="clear" w:color="auto" w:fill="F7F9FC"/>
           </w:tcPr>
           <w:p>
             <w:pPr>
@@ -4996,6 +5317,7 @@
         <w:tc>
           <w:tcPr>
             <w:tcW w:w="2126" w:type="dxa"/>
+            <w:shd w:val="clear" w:color="auto" w:fill="F7F9FC"/>
           </w:tcPr>
           <w:p>
             <w:pPr>
@@ -5014,6 +5336,7 @@
         <w:tc>
           <w:tcPr>
             <w:tcW w:w="1701" w:type="dxa"/>
+            <w:shd w:val="clear" w:color="auto" w:fill="F7F9FC"/>
           </w:tcPr>
           <w:p>
             <w:pPr>
@@ -5041,6 +5364,7 @@
         <w:tc>
           <w:tcPr>
             <w:tcW w:w="2237" w:type="dxa"/>
+            <w:shd w:val="clear" w:color="auto" w:fill="F7F9FC"/>
           </w:tcPr>
           <w:p>
             <w:pPr>
@@ -5205,6 +5529,7 @@
         <w:tc>
           <w:tcPr>
             <w:tcW w:w="674" w:type="dxa"/>
+            <w:shd w:val="clear" w:color="auto" w:fill="F7F9FC"/>
           </w:tcPr>
           <w:p>
             <w:pPr>
@@ -5226,6 +5551,7 @@
         <w:tc>
           <w:tcPr>
             <w:tcW w:w="2837" w:type="dxa"/>
+            <w:shd w:val="clear" w:color="auto" w:fill="F7F9FC"/>
           </w:tcPr>
           <w:p>
             <w:pPr>
@@ -5261,6 +5587,7 @@
         <w:tc>
           <w:tcPr>
             <w:tcW w:w="2126" w:type="dxa"/>
+            <w:shd w:val="clear" w:color="auto" w:fill="F7F9FC"/>
           </w:tcPr>
           <w:p>
             <w:pPr>
@@ -5279,6 +5606,7 @@
         <w:tc>
           <w:tcPr>
             <w:tcW w:w="1701" w:type="dxa"/>
+            <w:shd w:val="clear" w:color="auto" w:fill="F7F9FC"/>
           </w:tcPr>
           <w:p>
             <w:pPr>
@@ -5300,6 +5628,7 @@
         <w:tc>
           <w:tcPr>
             <w:tcW w:w="2237" w:type="dxa"/>
+            <w:shd w:val="clear" w:color="auto" w:fill="F7F9FC"/>
           </w:tcPr>
           <w:p>
             <w:pPr>
@@ -5540,7 +5869,19 @@
               <w:rPr>
                 <w:b/>
               </w:rPr>
-              <w:t>Eko Bharat ventures Pvt</w:t>
+              <w:t xml:space="preserve">Eko Bharat </w:t>
+            </w:r>
+            <w:r>
+              <w:rPr>
+                <w:b/>
+              </w:rPr>
+              <w:t>Ventures</w:t>
+            </w:r>
+            <w:r>
+              <w:rPr>
+                <w:b/>
+              </w:rPr>
+              <w:t xml:space="preserve"> Pvt</w:t>
             </w:r>
             <w:r>
               <w:rPr>
@@ -5584,6 +5925,7 @@
         </w:tc>
       </w:tr>
     </w:tbl>
+    <w:p/>
     <w:sectPr>
       <w:headerReference w:type="default" r:id="rId8"/>
       <w:footerReference w:type="default" r:id="rId9"/>

</xml_diff>